<commit_message>
Parse plan_name, foundation, builder from Salas PDF Description/Project fields
- Add _parse_hierarchy() to markdown_import.py
- Parses Description field pattern: Plan - Elevation, Foundation[, Variations]
- Parses Project field pattern: ProjectName; BuilderName
- Falls back to filename parsing when PDF fields are empty
- Sets hierarchy fields on payload so _extract_hierarchy() populates DB columns
</commit_message>
<xml_diff>
--- a/resload_roadmap_v3.docx
+++ b/resload_roadmap_v3.docx
@@ -62,7 +62,7 @@
           <w:sz w:val="20"/>
           <w:szCs w:val="20"/>
         </w:rPr>
-        <w:t xml:space="preserve">Living Document — Last updated: 2026-06-05  |  Version 3.3</w:t>
+        <w:t xml:space="preserve">Living Document — Last updated: 2026-06-05  |  Version 3.4</w:t>
       </w:r>
     </w:p>
     <w:p>
@@ -207,7 +207,7 @@
           </w:tcPr>
           <w:p>
             <w:r>
-              <w:t xml:space="preserve">ResLoad — Residential Load Calculator</w:t>
+              <w:t xml:space="preserve">VRC — Vallus Residential Calculator</w:t>
             </w:r>
           </w:p>
         </w:tc>
@@ -462,7 +462,7 @@
           </w:tcPr>
           <w:p>
             <w:r>
-              <w:t xml:space="preserve">Phase 3 — Complete</w:t>
+              <w:t xml:space="preserve">Phase 3.5 — Complete (Web Deployment)</w:t>
             </w:r>
           </w:p>
         </w:tc>
@@ -513,7 +513,7 @@
           </w:tcPr>
           <w:p>
             <w:r>
-              <w:t xml:space="preserve">3.1</w:t>
+              <w:t xml:space="preserve">3.4</w:t>
             </w:r>
           </w:p>
         </w:tc>
@@ -11318,7 +11318,7 @@
           </w:tcPr>
           <w:p>
             <w:r>
-              <w:t xml:space="preserve">SQLite (Phase 1). PostgreSQL-ready via SQLAlchemy ORM.</w:t>
+              <w:t xml:space="preserve">Supabase (PostgreSQL). Replaces the local SQLite file. Client via supabase-py.</w:t>
             </w:r>
           </w:p>
         </w:tc>
@@ -11369,7 +11369,7 @@
           </w:tcPr>
           <w:p>
             <w:r>
-              <w:t xml:space="preserve">WeasyPrint (Python) — server-side PDF from HTML/CSS templates.</w:t>
+              <w:t xml:space="preserve">ReportLab (Python) — server-side PDF generation; returns bytes via io.BytesIO.</w:t>
             </w:r>
           </w:p>
         </w:tc>
@@ -11573,7 +11573,7 @@
           </w:tcPr>
           <w:p>
             <w:r>
-              <w:t xml:space="preserve">Phase 1: local dev only. Phase 3+: Dockerized.</w:t>
+              <w:t xml:space="preserve">GitHub → Vercel (Python serverless + React static). Supabase (PostgreSQL). HTTP Basic Auth via APP_PASSWORD env var.</w:t>
             </w:r>
           </w:p>
         </w:tc>
@@ -11749,7 +11749,7 @@
           <w:sz w:val="18"/>
           <w:szCs w:val="18"/>
         </w:rPr>
-        <w:t xml:space="preserve">    reports/                 # WeasyPrint HTML/CSS templates</w:t>
+        <w:t xml:space="preserve">    reports/                 # ReportLab PDF generation</w:t>
       </w:r>
     </w:p>
     <w:p>
@@ -12386,15 +12386,60 @@
     </w:p>
     <w:p>
       <w:r>
+        <w:t xml:space="preserve">Do not run git commands from the AI agent’s sandbox.</w:t>
+      </w:r>
+    </w:p>
+    <w:p>
+      <w:r>
+        <w:t xml:space="preserve"> The project folder is mounted read-write but the git index.lock file cannot be removed from within the sandbox, which blocks all git operations. Instead, write the code changes and then give the user explicit commands to run in a fresh Terminal window. Always use the full path with trailing space: cd “/Users/will/Documents/Claude/Projects/WEBAPP - Load Calculation Software ”</w:t>
+      </w:r>
+    </w:p>
+    <w:p>
+      <w:r>
+        <w:t xml:space="preserve">Deployment is automatic via GitHub.</w:t>
+      </w:r>
+    </w:p>
+    <w:p>
+      <w:r>
+        <w:t xml:space="preserve"> Every push to the main branch triggers a Vercel redeploy. After giving the user git commands, the typical sequence is: git add [files], git commit -m “message”, git push. No manual Vercel deploy step is needed.</w:t>
+      </w:r>
+    </w:p>
+    <w:p>
+      <w:r>
+        <w:t xml:space="preserve">Never modify environment variables in code.</w:t>
+      </w:r>
+    </w:p>
+    <w:p>
+      <w:r>
+        <w:t xml:space="preserve"> The three required env vars are SUPABASE_URL, SUPABASE_SERVICE_ROLE_KEY, and APP_PASSWORD. In production these live in the Vercel dashboard (Settings → Environment Variables). Locally they go in a .env file that is git-ignored. Never commit secrets. See .env.example for the template.</w:t>
+      </w:r>
+    </w:p>
+    <w:p>
+      <w:r>
         <w:t xml:space="preserve"/>
       </w:r>
     </w:p>
     <w:p>
+      <w:r>
+        <w:t xml:space="preserve"/>
+      </w:r>
+    </w:p>
+    <w:p>
       <w:pPr>
         <w:pStyle w:val="Heading1"/>
       </w:pPr>
       <w:r>
         <w:t xml:space="preserve">11. Changelog</w:t>
+      </w:r>
+    </w:p>
+    <w:p>
+      <w:r>
+        <w:t>2026-06-05 — Version 3.4</w:t>
+      </w:r>
+    </w:p>
+    <w:p>
+      <w:r>
+        <w:t xml:space="preserve">Renamed the project from ResLoad to VRC (Vallus Residential Calculator). Established a structured project hierarchy for naming and database storage: Builder → Project/Subdivision → Plan → Calculation Entry (elevation, foundation, orientation, variations, source). PDF filename convention changed from “{Description} Resload.pdf” to “{Plan} {Elevation} {Foundation} {Orientation} {Variations}-vrc.pdf” (e.g. “Hickory C Slab-vrc.pdf”) to visually distinguish VRC reports from Salas O’Brien reports. Database migrated from local SQLite to Supabase (PostgreSQL); the calculations table stores the full engine payload as JSONB plus the structured hierarchy fields (builder_name, project_name, plan_name, elevation, foundation, orientation, variations, source) for filtering and comparison. The source field (‘vrc’ or ‘salas_import’) enables side-by-side comparison of VRC calculations against imported Salas O’Brien data for the same plan. Integer primary keys are preserved for frontend backward-compatibility. PDF generation refactored to return bytes via io.BytesIO so no temp file is written to disk (serverless-safe). Added HTTP Basic Auth middleware (APP_PASSWORD env var) protecting all routes except /api/health. Deployed to Vercel (Python serverless + React static frontend served via FastAPI StaticFiles). Repository published to GitHub at github.com/whmoyers3/vallus-rc. The comparison section in generated PDFs retitled to “VRC vs. SALAS O’BRIEN COMPARISON”. New files: supabase/schema.sql, requirements.txt, vercel.json, api/index.py, .gitignore, .env.example.</w:t>
       </w:r>
     </w:p>
     <w:p>

</xml_diff>